<commit_message>
docs(step12): exam schedule feature + Lambda STT/TTS architecture
- PRD/SRS/SDS/plan: exam window + schedule submit/withdraw, admin
  exam-schedule board with start/close/re-warm, keep-warm, balanced
  per-candidate question picking, per-candidate follow-up cap
  (US-22..25, FR-EXAM-06..09, FR-INT-13..14, UC-10, BR-12..14, NFR-15)
- Speech path: PhoWhisper/Whisper STT and Kokoro-82M TTS on Lambda;
  Google TTS optional, Web Speech fallback only; measured latencies
- ERD (Mermaid, migrations 001..018) exported to docs/erd.png,
  deployment diagram to docs/architecture-aws.png; SDS links erd.png
- Fix stale SDS columns (paused_at, no is_current, PENDING, no BACKUP_DB)
- E2E prod test flow: admin start step, remove plaintext admin password
- Workflow Definition + Data Flow docx updated to current architecture

Co-Authored-By: Claude Opus 5.5 <noreply@anthropic.com>
</commit_message>
<xml_diff>
--- a/docs/AIVES - Mô tả Luồng Dữ liệu (Data Flow).docx
+++ b/docs/AIVES - Mô tả Luồng Dữ liệu (Data Flow).docx
@@ -74,8 +74,8 @@
       </w:pPr>
       <w:r>
         <w:rPr>
-          <w:b w:val="1"/>
-          <w:bCs w:val="1"/>
+          <w:b/>
+          <w:bCs/>
           <w:rtl w:val="0"/>
         </w:rPr>
         <w:t xml:space="preserve">Thu âm &amp; Gửi dữ liệu:</w:t>
@@ -84,15 +84,29 @@
         <w:rPr>
           <w:rtl w:val="0"/>
         </w:rPr>
-        <w:t xml:space="preserve"> Student nói vào micro trên Browser. Gói dữ liệu âm thanh được mã hóa và gửi qua </w:t>
-      </w:r>
-      <w:r>
-        <w:rPr>
-          <w:b w:val="1"/>
-          <w:bCs w:val="1"/>
-          <w:rtl w:val="0"/>
-        </w:rPr>
-        <w:t xml:space="preserve">API Gateway</w:t>
+        <w:t xml:space="preserve"> Student nói vào micro trên Browser. Khi nộp câu trả lời, file âm thanh được gửi qua HTTPS (</w:t>
+      </w:r>
+      <w:r>
+        <w:rPr>
+          <w:b/>
+          <w:bCs/>
+          <w:rtl w:val="0"/>
+        </w:rPr>
+        <w:t xml:space="preserve">CloudFront</w:t>
+      </w:r>
+      <w:r>
+        <w:rPr>
+          <w:rtl w:val="0"/>
+        </w:rPr>
+        <w:t xml:space="preserve">, đường /api) tới </w:t>
+      </w:r>
+      <w:r>
+        <w:rPr>
+          <w:b/>
+          <w:bCs/>
+          <w:rtl w:val="0"/>
+        </w:rPr>
+        <w:t xml:space="preserve">backend Node.js chạy Docker trên EC2</w:t>
       </w:r>
       <w:r>
         <w:rPr>
@@ -115,36 +129,22 @@
       </w:pPr>
       <w:r>
         <w:rPr>
-          <w:b w:val="1"/>
-          <w:bCs w:val="1"/>
-          <w:rtl w:val="0"/>
-        </w:rPr>
-        <w:t xml:space="preserve">Lưu trữ gốc &amp; Kích hoạt xử lý:</w:t>
-      </w:r>
-      <w:r>
-        <w:rPr>
-          <w:rtl w:val="0"/>
-        </w:rPr>
-        <w:t xml:space="preserve"> API Gateway kích hoạt </w:t>
-      </w:r>
-      <w:r>
-        <w:rPr>
-          <w:b w:val="1"/>
-          <w:bCs w:val="1"/>
-          <w:rtl w:val="0"/>
-        </w:rPr>
-        <w:t xml:space="preserve">AWS Lambda</w:t>
-      </w:r>
-      <w:r>
-        <w:rPr>
-          <w:rtl w:val="0"/>
-        </w:rPr>
-        <w:t xml:space="preserve"> (Write Lambda). Lambda này lưu file âm thanh thô vào </w:t>
-      </w:r>
-      <w:r>
-        <w:rPr>
-          <w:b w:val="1"/>
-          <w:bCs w:val="1"/>
+          <w:b/>
+          <w:bCs/>
+          <w:rtl w:val="0"/>
+        </w:rPr>
+        <w:t xml:space="preserve">Lưu trữ gốc:</w:t>
+      </w:r>
+      <w:r>
+        <w:rPr>
+          <w:rtl w:val="0"/>
+        </w:rPr>
+        <w:t xml:space="preserve"> Backend lưu file âm thanh thô vào </w:t>
+      </w:r>
+      <w:r>
+        <w:rPr>
+          <w:b/>
+          <w:bCs/>
           <w:rtl w:val="0"/>
         </w:rPr>
         <w:t xml:space="preserve">Amazon S3</w:t>
@@ -153,7 +153,7 @@
         <w:rPr>
           <w:rtl w:val="0"/>
         </w:rPr>
-        <w:t xml:space="preserve"> để lưu trữ dài hạn.</w:t>
+        <w:t xml:space="preserve"> (bucket audio) để giảng viên nghe lại; lỗi thì thử lại tối đa 3 lần.</w:t>
       </w:r>
     </w:p>
     <w:p>
@@ -170,8 +170,8 @@
       </w:pPr>
       <w:r>
         <w:rPr>
-          <w:b w:val="1"/>
-          <w:bCs w:val="1"/>
+          <w:b/>
+          <w:bCs/>
           <w:rtl w:val="0"/>
         </w:rPr>
         <w:t xml:space="preserve">Chuyển đổi Giọng nói:</w:t>
@@ -180,21 +180,21 @@
         <w:rPr>
           <w:rtl w:val="0"/>
         </w:rPr>
-        <w:t xml:space="preserve"> Ngay sau khi lưu, Lambda gọi </w:t>
-      </w:r>
-      <w:r>
-        <w:rPr>
-          <w:b w:val="1"/>
-          <w:bCs w:val="1"/>
-          <w:rtl w:val="0"/>
-        </w:rPr>
-        <w:t xml:space="preserve">Amazon Transcribe</w:t>
-      </w:r>
-      <w:r>
-        <w:rPr>
-          <w:rtl w:val="0"/>
-        </w:rPr>
-        <w:t xml:space="preserve"> để dịch file âm thanh vừa lưu thành dạng văn bản (Text).</w:t>
+        <w:t xml:space="preserve"> Backend gọi đồng bộ </w:t>
+      </w:r>
+      <w:r>
+        <w:rPr>
+          <w:b/>
+          <w:bCs/>
+          <w:rtl w:val="0"/>
+        </w:rPr>
+        <w:t xml:space="preserve">AWS Lambda STT</w:t>
+      </w:r>
+      <w:r>
+        <w:rPr>
+          <w:rtl w:val="0"/>
+        </w:rPr>
+        <w:t xml:space="preserve"> (aives-prod-stt: PhoWhisper-small cho tiếng Việt, Whisper small cho tiếng Anh), audio nằm trong payload, nhận lại văn bản (Text).</w:t>
       </w:r>
     </w:p>
     <w:p>
@@ -211,8 +211,8 @@
       </w:pPr>
       <w:r>
         <w:rPr>
-          <w:b w:val="1"/>
-          <w:bCs w:val="1"/>
+          <w:b/>
+          <w:bCs/>
           <w:rtl w:val="0"/>
         </w:rPr>
         <w:t xml:space="preserve">Xử lý Ngữ cảnh (AI Brain):</w:t>
@@ -221,26 +221,12 @@
         <w:rPr>
           <w:rtl w:val="0"/>
         </w:rPr>
-        <w:t xml:space="preserve"> Văn bản đầu vào được gửi tới </w:t>
-      </w:r>
-      <w:r>
-        <w:rPr>
-          <w:b w:val="1"/>
-          <w:bCs w:val="1"/>
-          <w:rtl w:val="0"/>
-        </w:rPr>
-        <w:t xml:space="preserve">Amazon Bedrock</w:t>
-      </w:r>
-      <w:r>
-        <w:rPr>
-          <w:rtl w:val="0"/>
-        </w:rPr>
-        <w:t xml:space="preserve">. Đồng thời, Bedrock truy xuất </w:t>
-      </w:r>
-      <w:r>
-        <w:rPr>
-          <w:b w:val="1"/>
-          <w:bCs w:val="1"/>
+        <w:t xml:space="preserve"> Backend đọc ngữ cảnh phiên (Session Context) từ </w:t>
+      </w:r>
+      <w:r>
+        <w:rPr>
+          <w:b/>
+          <w:bCs/>
           <w:rtl w:val="0"/>
         </w:rPr>
         <w:t xml:space="preserve">Amazon DynamoDB</w:t>
@@ -249,7 +235,21 @@
         <w:rPr>
           <w:rtl w:val="0"/>
         </w:rPr>
-        <w:t xml:space="preserve"> để đọc ngữ cảnh phỏng vấn hiện tại (Session Context). Bedrock phân tích câu trả lời và tự động sinh ra câu hỏi tiếp theo (Text).</w:t>
+        <w:t xml:space="preserve"> (dựng lại từ Postgres nếu mất), rồi gửi câu hỏi, ý chính và câu trả lời tới </w:t>
+      </w:r>
+      <w:r>
+        <w:rPr>
+          <w:b/>
+          <w:bCs/>
+          <w:rtl w:val="0"/>
+        </w:rPr>
+        <w:t xml:space="preserve">Amazon Bedrock Nova Pro</w:t>
+      </w:r>
+      <w:r>
+        <w:rPr>
+          <w:rtl w:val="0"/>
+        </w:rPr>
+        <w:t xml:space="preserve">. Bedrock chỉ đề xuất hỏi xoáy hay sang câu chính tiếp; backend áp các giới hạn: hạn chót phiên, câu trả lời trống, số lượt xoáy mỗi câu và mỗi thí sinh.</w:t>
       </w:r>
     </w:p>
     <w:p>
@@ -266,8 +266,8 @@
       </w:pPr>
       <w:r>
         <w:rPr>
-          <w:b w:val="1"/>
-          <w:bCs w:val="1"/>
+          <w:b/>
+          <w:bCs/>
           <w:rtl w:val="0"/>
         </w:rPr>
         <w:t xml:space="preserve">Cập nhật Trạng thái:</w:t>
@@ -276,12 +276,26 @@
         <w:rPr>
           <w:rtl w:val="0"/>
         </w:rPr>
-        <w:t xml:space="preserve"> Trạng thái cuộc hội thoại mới được ghi đè/cập nhật lại vào </w:t>
-      </w:r>
-      <w:r>
-        <w:rPr>
-          <w:b w:val="1"/>
-          <w:bCs w:val="1"/>
+        <w:t xml:space="preserve"> Lượt hỏi đáp được ghi vào </w:t>
+      </w:r>
+      <w:r>
+        <w:rPr>
+          <w:b/>
+          <w:bCs/>
+          <w:rtl w:val="0"/>
+        </w:rPr>
+        <w:t xml:space="preserve">Postgres</w:t>
+      </w:r>
+      <w:r>
+        <w:rPr>
+          <w:rtl w:val="0"/>
+        </w:rPr>
+        <w:t xml:space="preserve"> (nguồn dữ liệu chính, chạy cùng EC2); ngữ cảnh phiên mới được cập nhật vào </w:t>
+      </w:r>
+      <w:r>
+        <w:rPr>
+          <w:b/>
+          <w:bCs/>
           <w:rtl w:val="0"/>
         </w:rPr>
         <w:t xml:space="preserve">Amazon DynamoDB</w:t>
@@ -307,8 +321,8 @@
       </w:pPr>
       <w:r>
         <w:rPr>
-          <w:b w:val="1"/>
-          <w:bCs w:val="1"/>
+          <w:b/>
+          <w:bCs/>
           <w:rtl w:val="0"/>
         </w:rPr>
         <w:t xml:space="preserve">Tổng hợp Giọng nói:</w:t>
@@ -317,21 +331,21 @@
         <w:rPr>
           <w:rtl w:val="0"/>
         </w:rPr>
-        <w:t xml:space="preserve"> Câu hỏi bằng văn bản từ Bedrock được chuyển sang </w:t>
-      </w:r>
-      <w:r>
-        <w:rPr>
-          <w:b w:val="1"/>
-          <w:bCs w:val="1"/>
-          <w:rtl w:val="0"/>
-        </w:rPr>
-        <w:t xml:space="preserve">Amazon Polly</w:t>
-      </w:r>
-      <w:r>
-        <w:rPr>
-          <w:rtl w:val="0"/>
-        </w:rPr>
-        <w:t xml:space="preserve"> để biến thành giọng nói (Audio Stream).</w:t>
+        <w:t xml:space="preserve"> Câu hỏi tiếp theo được chuyển sang </w:t>
+      </w:r>
+      <w:r>
+        <w:rPr>
+          <w:b/>
+          <w:bCs/>
+          <w:rtl w:val="0"/>
+        </w:rPr>
+        <w:t xml:space="preserve">AWS Lambda TTS</w:t>
+      </w:r>
+      <w:r>
+        <w:rPr>
+          <w:rtl w:val="0"/>
+        </w:rPr>
+        <w:t xml:space="preserve"> (aives-prod-tts, Kokoro-82M) để thành file WAV, cache trong S3 tại tts-cache/&lt;sha256&gt;.wav; câu chính đã có audio tạo sẵn thì dùng lại.</w:t>
       </w:r>
     </w:p>
     <w:p>
@@ -348,8 +362,8 @@
       </w:pPr>
       <w:r>
         <w:rPr>
-          <w:b w:val="1"/>
-          <w:bCs w:val="1"/>
+          <w:b/>
+          <w:bCs/>
           <w:rtl w:val="0"/>
         </w:rPr>
         <w:t xml:space="preserve">Phản hồi Client:</w:t>
@@ -358,35 +372,48 @@
         <w:rPr>
           <w:rtl w:val="0"/>
         </w:rPr>
-        <w:t xml:space="preserve"> Đoạn âm thanh câu hỏi từ Polly được trả ngược lại thông qua </w:t>
-      </w:r>
-      <w:r>
-        <w:rPr>
-          <w:b w:val="1"/>
-          <w:bCs w:val="1"/>
-          <w:rtl w:val="0"/>
-        </w:rPr>
-        <w:t xml:space="preserve">API Gateway</w:t>
-      </w:r>
-      <w:r>
-        <w:rPr>
-          <w:rtl w:val="0"/>
-        </w:rPr>
-        <w:t xml:space="preserve"> về </w:t>
-      </w:r>
-      <w:r>
-        <w:rPr>
-          <w:b w:val="1"/>
-          <w:bCs w:val="1"/>
-          <w:rtl w:val="0"/>
-        </w:rPr>
-        <w:t xml:space="preserve">Browser</w:t>
-      </w:r>
-      <w:r>
-        <w:rPr>
-          <w:rtl w:val="0"/>
-        </w:rPr>
-        <w:t xml:space="preserve"> để sinh viên nghe và tiếp tục vòng lặp (cho đến khi hệ thống xác nhận đạt điều kiện dừng cuộc phỏng vấn).</w:t>
+        <w:t xml:space="preserve"> Backend trả câu hỏi (chữ và link audio) về Browser để sinh viên nghe và tiếp tục vòng lặp cho tới khi hết câu hoặc hết giờ. Nếu audio lỗi, trình duyệt đọc bằng Web Speech (chỉ là dự phòng).</w:t>
+      </w:r>
+    </w:p>
+    <w:p>
+      <w:pPr>
+        <w:numPr>
+          <w:ilvl w:val="0"/>
+          <w:numId w:val="3"/>
+        </w:numPr>
+        <w:spacing w:after="0" w:afterAutospacing="0" w:before="0" w:beforeAutospacing="0" w:lineRule="auto"/>
+        <w:ind w:left="720" w:hanging="360"/>
+        <w:rPr>
+          <w:u w:val="none"/>
+        </w:rPr>
+      </w:pPr>
+      <w:r>
+        <w:rPr>
+          <w:b/>
+          <w:bCs/>
+          <w:rtl w:val="0"/>
+        </w:rPr>
+        <w:t xml:space="preserve">Kết thúc phiên:</w:t>
+      </w:r>
+      <w:r>
+        <w:rPr>
+          <w:rtl w:val="0"/>
+        </w:rPr>
+        <w:t xml:space="preserve"> Backend lưu transcript, tạo viva_result PENDING và xếp việc GRADE_INTERVIEW vào bảng </w:t>
+      </w:r>
+      <w:r>
+        <w:rPr>
+          <w:b/>
+          <w:bCs/>
+          <w:rtl w:val="0"/>
+        </w:rPr>
+        <w:t xml:space="preserve">background_job</w:t>
+      </w:r>
+      <w:r>
+        <w:rPr>
+          <w:rtl w:val="0"/>
+        </w:rPr>
+        <w:t xml:space="preserve"> trong Postgres (không dùng API Gateway, Transcribe, Polly, SQS hay Step Functions).</w:t>
       </w:r>
     </w:p>
     <w:p>
@@ -441,12 +468,7 @@
         <w:rPr>
           <w:rtl w:val="0"/>
         </w:rPr>
-        <w:t xml:space="preserve">Để hình dung cách các dịch vụ AWS tương tác với nhau trong thời gian thực, đây là luồng xử lý khi một sinh viên trả lời một câu hỏi:</w:t>
-      </w:r>
-      <w:r>
-        <w:rPr>
-          <w:rtl w:val="0"/>
-        </w:rPr>
+        <w:t xml:space="preserve">Sau khi phiên thi kết thúc, việc chấm điểm chạy nền trên backend như sau:</w:t>
       </w:r>
     </w:p>
     <w:p>
@@ -462,89 +484,283 @@
         <w:rPr>
           <w:rtl w:val="0"/>
         </w:rPr>
-        <w:t xml:space="preserve">Khi Bedrock xác định cuộc thi kết thúc, </w:t>
-      </w:r>
-      <w:r>
+        <w:t xml:space="preserve">Khi phiên thi kết thúc, backend xếp việc GRADE_INTERVIEW vào bảng </w:t>
+      </w:r>
+      <w:r>
+        <w:rPr>
+          <w:b/>
+          <w:bCs/>
+          <w:rtl w:val="0"/>
+        </w:rPr>
+        <w:t xml:space="preserve">background_job</w:t>
+      </w:r>
+      <w:r>
+        <w:rPr>
+          <w:rtl w:val="0"/>
+        </w:rPr>
+        <w:t xml:space="preserve"> trong Postgres (không dùng Lambda, SQS hay Step Functions).</w:t>
+      </w:r>
+    </w:p>
+    <w:p>
+      <w:pPr>
+        <w:numPr>
+          <w:ilvl w:val="0"/>
+          <w:numId w:val="2"/>
+        </w:numPr>
+        <w:spacing w:after="0" w:afterAutospacing="0" w:before="0" w:beforeAutospacing="0" w:lineRule="auto"/>
+        <w:ind w:left="720" w:hanging="360"/>
+      </w:pPr>
+      <w:r>
+        <w:rPr>
+          <w:rtl w:val="0"/>
+        </w:rPr>
+        <w:t xml:space="preserve">Worker trong backend lấy việc (FOR UPDATE SKIP LOCKED), đọc transcript, câu hỏi, ý chính và rubric tương ứng từ </w:t>
+      </w:r>
+      <w:r>
+        <w:rPr>
+          <w:b/>
+          <w:bCs/>
+          <w:rtl w:val="0"/>
+        </w:rPr>
+        <w:t xml:space="preserve">Postgres</w:t>
+      </w:r>
+      <w:r>
+        <w:rPr>
+          <w:rtl w:val="0"/>
+        </w:rPr>
+        <w:t xml:space="preserve"> chạy trong Docker trên EC2 (không dùng RDS).</w:t>
+      </w:r>
+    </w:p>
+    <w:p>
+      <w:pPr>
+        <w:numPr>
+          <w:ilvl w:val="0"/>
+          <w:numId w:val="2"/>
+        </w:numPr>
+        <w:spacing w:after="0" w:afterAutospacing="0" w:before="0" w:beforeAutospacing="0" w:lineRule="auto"/>
+        <w:ind w:left="720" w:hanging="360"/>
+      </w:pPr>
+      <w:r>
+        <w:rPr>
+          <w:rtl w:val="0"/>
+        </w:rPr>
+        <w:t xml:space="preserve">Dữ liệu được gửi tới </w:t>
+      </w:r>
+      <w:r>
+        <w:rPr>
+          <w:b/>
+          <w:bCs/>
+          <w:rtl w:val="0"/>
+        </w:rPr>
+        <w:t xml:space="preserve">Amazon Bedrock Nova Pro</w:t>
+      </w:r>
+      <w:r>
+        <w:rPr>
+          <w:rtl w:val="0"/>
+        </w:rPr>
+        <w:t xml:space="preserve"> (tool use ép JSON). Bedrock đóng vai giám khảo, chấm từng tiêu chí kèm bằng chứng trích từ transcript, xuất ra Suggested Score và Feedback; backend kiểm tra điểm, bằng chứng và gắn cờ khi độ tin cậy thấp.</w:t>
+      </w:r>
+    </w:p>
+    <w:p>
+      <w:pPr>
+        <w:numPr>
+          <w:ilvl w:val="0"/>
+          <w:numId w:val="2"/>
+        </w:numPr>
+        <w:spacing w:after="0" w:afterAutospacing="0" w:before="0" w:beforeAutospacing="0" w:lineRule="auto"/>
+        <w:ind w:left="720" w:hanging="360"/>
+      </w:pPr>
+      <w:r>
+        <w:rPr>
+          <w:rtl w:val="0"/>
+        </w:rPr>
+        <w:t xml:space="preserve">Kết quả được lưu vào Postgres (AI_SUGGESTED hoặc FLAGGED); frontend React hiện màn review cho Lecturer, audio trả lời phát từ </w:t>
+      </w:r>
+      <w:r>
+        <w:rPr>
+          <w:b/>
+          <w:bCs/>
+          <w:rtl w:val="0"/>
+        </w:rPr>
+        <w:t xml:space="preserve">Amazon S3</w:t>
+      </w:r>
+      <w:r>
+        <w:rPr>
+          <w:rtl w:val="0"/>
+        </w:rPr>
+        <w:t xml:space="preserve"> qua backend.</w:t>
+      </w:r>
+    </w:p>
+    <w:p>
+      <w:pPr>
+        <w:numPr>
+          <w:ilvl w:val="0"/>
+          <w:numId w:val="2"/>
+        </w:numPr>
+        <w:spacing w:after="240" w:before="0" w:beforeAutospacing="0" w:lineRule="auto"/>
+        <w:ind w:left="720" w:hanging="360"/>
+      </w:pPr>
+      <w:r>
+        <w:rPr>
+          <w:rtl w:val="0"/>
+        </w:rPr>
+        <w:t xml:space="preserve">Sau khi Lecturer xác nhận hoặc chỉnh sửa (có lý do, lưu lịch sử), điểm cuối cùng được chốt vào </w:t>
+      </w:r>
+      <w:r>
+        <w:rPr>
+          <w:b/>
+          <w:bCs/>
+          <w:rtl w:val="0"/>
+        </w:rPr>
+        <w:t xml:space="preserve">Postgres</w:t>
+      </w:r>
+      <w:r>
+        <w:rPr>
+          <w:rtl w:val="0"/>
+        </w:rPr>
+        <w:t xml:space="preserve">, kết thúc vòng đời của bài thi.</w:t>
+      </w:r>
+    </w:p>
+    <w:p>
+      <w:pPr>
+        <w:rPr/>
+      </w:pPr>
+    </w:p>
+    <w:p>
+      <w:pPr>
+        <w:pStyle w:val="Heading2"/>
+        <w:keepNext w:val="0"/>
+        <w:keepLines w:val="0"/>
+        <w:numPr>
+          <w:ilvl w:val="0"/>
+          <w:numId w:val="1"/>
+        </w:numPr>
+        <w:spacing w:before="280" w:lineRule="auto"/>
+        <w:ind w:left="720" w:hanging="360"/>
         <w:rPr>
           <w:b w:val="1"/>
           <w:bCs w:val="1"/>
-          <w:rtl w:val="0"/>
-        </w:rPr>
-        <w:t xml:space="preserve">AWS Lambda</w:t>
-      </w:r>
-      <w:r>
-        <w:rPr>
-          <w:rtl w:val="0"/>
-        </w:rPr>
-        <w:t xml:space="preserve"> sẽ kích hoạt Scoring Service.</w:t>
-      </w:r>
-    </w:p>
-    <w:p>
-      <w:pPr>
-        <w:numPr>
-          <w:ilvl w:val="0"/>
-          <w:numId w:val="2"/>
-        </w:numPr>
-        <w:spacing w:after="0" w:afterAutospacing="0" w:before="0" w:beforeAutospacing="0" w:lineRule="auto"/>
-        <w:ind w:left="720" w:hanging="360"/>
-      </w:pPr>
-      <w:r>
-        <w:rPr>
-          <w:rtl w:val="0"/>
-        </w:rPr>
-        <w:t xml:space="preserve">Hệ thống query toàn bộ đoạn hội thoại (Transcript) và Tiêu chí (Rubric) tương ứng từ </w:t>
-      </w:r>
+        </w:rPr>
+      </w:pPr>
       <w:r>
         <w:rPr>
           <w:b w:val="1"/>
           <w:bCs w:val="1"/>
           <w:rtl w:val="0"/>
         </w:rPr>
-        <w:t xml:space="preserve">Amazon RDS</w:t>
-      </w:r>
-      <w:r>
-        <w:rPr>
-          <w:rtl w:val="0"/>
-        </w:rPr>
-        <w:t xml:space="preserve">.</w:t>
-      </w:r>
-    </w:p>
-    <w:p>
-      <w:pPr>
-        <w:numPr>
-          <w:ilvl w:val="0"/>
-          <w:numId w:val="2"/>
-        </w:numPr>
-        <w:spacing w:after="0" w:afterAutospacing="0" w:before="0" w:beforeAutospacing="0" w:lineRule="auto"/>
-        <w:ind w:left="720" w:hanging="360"/>
-      </w:pPr>
-      <w:r>
-        <w:rPr>
-          <w:rtl w:val="0"/>
-        </w:rPr>
-        <w:t xml:space="preserve">Dữ liệu này được đẩy vào </w:t>
-      </w:r>
-      <w:r>
+        <w:t xml:space="preserve">Khởi động Kỳ thi &amp; Làm nóng (Exam Start / Warm-up Flow)</w:t>
+      </w:r>
+    </w:p>
+    <w:p>
+      <w:pPr>
+        <w:spacing w:after="240" w:before="240" w:lineRule="auto"/>
         <w:rPr>
           <w:b w:val="1"/>
           <w:bCs w:val="1"/>
-          <w:rtl w:val="0"/>
-        </w:rPr>
-        <w:t xml:space="preserve">Amazon Bedrock</w:t>
-      </w:r>
-      <w:r>
-        <w:rPr>
-          <w:rtl w:val="0"/>
-        </w:rPr>
-        <w:t xml:space="preserve">. AgentCore sẽ đóng vai trò giám khảo, phân tích đối chiếu Transcript với Rubric, sau đó xuất ra </w:t>
-      </w:r>
-      <w:r>
-        <w:rPr>
-          <w:b w:val="1"/>
-          <w:bCs w:val="1"/>
-          <w:rtl w:val="0"/>
-        </w:rPr>
-        <w:t xml:space="preserve">Suggested Score</w:t>
+          <w:color w:val="000000"/>
+          <w:sz w:val="26"/>
+          <w:szCs w:val="26"/>
+        </w:rPr>
+      </w:pPr>
+      <w:r>
+        <w:rPr>
+          <w:rtl w:val="0"/>
+        </w:rPr>
+        <w:t xml:space="preserve">Luồng dữ liệu từ lúc giảng viên gửi lịch tới lúc sinh viên bắt đầu phiên thi:</w:t>
+      </w:r>
+    </w:p>
+    <w:p>
+      <w:pPr>
+        <w:numPr>
+          <w:ilvl w:val="0"/>
+          <w:numId w:val="4"/>
+        </w:numPr>
+        <w:spacing w:after="0" w:afterAutospacing="0" w:before="0" w:beforeAutospacing="0" w:lineRule="auto"/>
+        <w:ind w:left="720" w:hanging="360"/>
+      </w:pPr>
+      <w:r>
+        <w:rPr>
+          <w:b/>
+          <w:bCs/>
+          <w:rtl w:val="0"/>
+        </w:rPr>
+        <w:t xml:space="preserve">Gửi lịch:</w:t>
+      </w:r>
+      <w:r>
+        <w:rPr>
+          <w:rtl w:val="0"/>
+        </w:rPr>
+        <w:t xml:space="preserve"> Lecturer bấm Gửi lịch; backend kiểm tra khung giờ và đủ câu Đã duyệt theo từng mức Bloom trong </w:t>
+      </w:r>
+      <w:r>
+        <w:rPr>
+          <w:b/>
+          <w:bCs/>
+          <w:rtl w:val="0"/>
+        </w:rPr>
+        <w:t xml:space="preserve">Postgres</w:t>
+      </w:r>
+      <w:r>
+        <w:rPr>
+          <w:rtl w:val="0"/>
+        </w:rPr>
+        <w:t xml:space="preserve">, rồi chuyển kỳ thi DRAFT → SCHEDULED.</w:t>
+      </w:r>
+    </w:p>
+    <w:p>
+      <w:pPr>
+        <w:numPr>
+          <w:ilvl w:val="0"/>
+          <w:numId w:val="4"/>
+        </w:numPr>
+        <w:spacing w:after="0" w:afterAutospacing="0" w:before="0" w:beforeAutospacing="0" w:lineRule="auto"/>
+        <w:ind w:left="720" w:hanging="360"/>
+      </w:pPr>
+      <w:r>
+        <w:rPr>
+          <w:b/>
+          <w:bCs/>
+          <w:rtl w:val="0"/>
+        </w:rPr>
+        <w:t xml:space="preserve">Khởi động:</w:t>
+      </w:r>
+      <w:r>
+        <w:rPr>
+          <w:rtl w:val="0"/>
+        </w:rPr>
+        <w:t xml:space="preserve"> Admin bấm Khởi động trên Bảng lịch thi; trong một transaction Postgres, kỳ thi chuyển OPEN, ghi started_at, started_by và khoá rubric các câu Đã duyệt.</w:t>
+      </w:r>
+    </w:p>
+    <w:p>
+      <w:pPr>
+        <w:numPr>
+          <w:ilvl w:val="0"/>
+          <w:numId w:val="4"/>
+        </w:numPr>
+        <w:spacing w:after="0" w:afterAutospacing="0" w:before="0" w:beforeAutospacing="0" w:lineRule="auto"/>
+        <w:ind w:left="720" w:hanging="360"/>
+      </w:pPr>
+      <w:r>
+        <w:rPr>
+          <w:b/>
+          <w:bCs/>
+          <w:rtl w:val="0"/>
+        </w:rPr>
+        <w:t xml:space="preserve">Làm nóng:</w:t>
+      </w:r>
+      <w:r>
+        <w:rPr>
+          <w:rtl w:val="0"/>
+        </w:rPr>
+        <w:t xml:space="preserve"> Backend gọi song song </w:t>
+      </w:r>
+      <w:r>
+        <w:rPr>
+          <w:b/>
+          <w:bCs/>
+          <w:rtl w:val="0"/>
+        </w:rPr>
+        <w:t xml:space="preserve">AWS Lambda STT</w:t>
       </w:r>
       <w:r>
         <w:rPr>
@@ -554,77 +770,117 @@
       </w:r>
       <w:r>
         <w:rPr>
-          <w:b w:val="1"/>
-          <w:bCs w:val="1"/>
-          <w:rtl w:val="0"/>
-        </w:rPr>
-        <w:t xml:space="preserve">Feedback</w:t>
-      </w:r>
-      <w:r>
-        <w:rPr>
-          <w:rtl w:val="0"/>
-        </w:rPr>
-        <w:t xml:space="preserve">.</w:t>
-      </w:r>
-    </w:p>
-    <w:p>
-      <w:pPr>
-        <w:numPr>
-          <w:ilvl w:val="0"/>
-          <w:numId w:val="2"/>
+          <w:b/>
+          <w:bCs/>
+          <w:rtl w:val="0"/>
+        </w:rPr>
+        <w:t xml:space="preserve">AWS Lambda TTS</w:t>
+      </w:r>
+      <w:r>
+        <w:rPr>
+          <w:rtl w:val="0"/>
+        </w:rPr>
+        <w:t xml:space="preserve"> theo ngôn ngữ kỳ thi (không chặn yêu cầu của Admin); kết quả ghi vào exam_session.warm_status.</w:t>
+      </w:r>
+    </w:p>
+    <w:p>
+      <w:pPr>
+        <w:numPr>
+          <w:ilvl w:val="0"/>
+          <w:numId w:val="4"/>
         </w:numPr>
         <w:spacing w:after="0" w:afterAutospacing="0" w:before="0" w:beforeAutospacing="0" w:lineRule="auto"/>
         <w:ind w:left="720" w:hanging="360"/>
       </w:pPr>
       <w:r>
         <w:rPr>
-          <w:rtl w:val="0"/>
-        </w:rPr>
-        <w:t xml:space="preserve">Kết quả được lưu tạm, Backend NodeJS (</w:t>
-      </w:r>
-      <w:r>
-        <w:rPr>
-          <w:b w:val="1"/>
-          <w:bCs w:val="1"/>
-          <w:rtl w:val="0"/>
-        </w:rPr>
-        <w:t xml:space="preserve">EC2/Docker</w:t>
-      </w:r>
-      <w:r>
-        <w:rPr>
-          <w:rtl w:val="0"/>
-        </w:rPr>
-        <w:t xml:space="preserve">) sẽ render giao diện review cho Lecturer.</w:t>
-      </w:r>
-    </w:p>
-    <w:p>
-      <w:pPr>
-        <w:numPr>
-          <w:ilvl w:val="0"/>
-          <w:numId w:val="2"/>
-        </w:numPr>
-        <w:spacing w:after="240" w:before="0" w:beforeAutospacing="0" w:lineRule="auto"/>
-        <w:ind w:left="720" w:hanging="360"/>
-      </w:pPr>
-      <w:r>
-        <w:rPr>
-          <w:rtl w:val="0"/>
-        </w:rPr>
-        <w:t xml:space="preserve">Sau khi Lecturer xem xét và ấn "Xác nhận" hoặc "Chỉnh sửa", điểm cuối cùng sẽ được ghi chốt vào </w:t>
-      </w:r>
-      <w:r>
-        <w:rPr>
-          <w:b w:val="1"/>
-          <w:bCs w:val="1"/>
-          <w:rtl w:val="0"/>
-        </w:rPr>
-        <w:t xml:space="preserve">Amazon RDS</w:t>
-      </w:r>
-      <w:r>
-        <w:rPr>
-          <w:rtl w:val="0"/>
-        </w:rPr>
-        <w:t xml:space="preserve">, kết thúc vòng đời của bài thi.</w:t>
+          <w:b/>
+          <w:bCs/>
+          <w:rtl w:val="0"/>
+        </w:rPr>
+        <w:t xml:space="preserve">Tạo sẵn audio:</w:t>
+      </w:r>
+      <w:r>
+        <w:rPr>
+          <w:rtl w:val="0"/>
+        </w:rPr>
+        <w:t xml:space="preserve"> Việc nền PREPARE_EXAM_AUDIO gọi Lambda TTS cho mọi câu Đã duyệt của chủ đề, lưu WAV vào </w:t>
+      </w:r>
+      <w:r>
+        <w:rPr>
+          <w:b/>
+          <w:bCs/>
+          <w:rtl w:val="0"/>
+        </w:rPr>
+        <w:t xml:space="preserve">Amazon S3</w:t>
+      </w:r>
+      <w:r>
+        <w:rPr>
+          <w:rtl w:val="0"/>
+        </w:rPr>
+        <w:t xml:space="preserve"> (tts-cache/) và ghi tiến độ đã xong/tổng.</w:t>
+      </w:r>
+    </w:p>
+    <w:p>
+      <w:pPr>
+        <w:numPr>
+          <w:ilvl w:val="0"/>
+          <w:numId w:val="4"/>
+        </w:numPr>
+        <w:spacing w:after="0" w:afterAutospacing="0" w:before="0" w:beforeAutospacing="0" w:lineRule="auto"/>
+        <w:ind w:left="720" w:hanging="360"/>
+      </w:pPr>
+      <w:r>
+        <w:rPr>
+          <w:b/>
+          <w:bCs/>
+          <w:rtl w:val="0"/>
+        </w:rPr>
+        <w:t xml:space="preserve">Giữ nóng:</w:t>
+      </w:r>
+      <w:r>
+        <w:rPr>
+          <w:rtl w:val="0"/>
+        </w:rPr>
+        <w:t xml:space="preserve"> Việc nền KEEP_WARM gọi lại hai Lambda mỗi 5 phút tới closes_at, hoặc tới khi kỳ thi không còn OPEN.</w:t>
+      </w:r>
+    </w:p>
+    <w:p>
+      <w:pPr>
+        <w:numPr>
+          <w:ilvl w:val="0"/>
+          <w:numId w:val="4"/>
+        </w:numPr>
+        <w:spacing w:after="0" w:afterAutospacing="0" w:before="0" w:beforeAutospacing="0" w:lineRule="auto"/>
+        <w:ind w:left="720" w:hanging="360"/>
+      </w:pPr>
+      <w:r>
+        <w:rPr>
+          <w:b/>
+          <w:bCs/>
+          <w:rtl w:val="0"/>
+        </w:rPr>
+        <w:t xml:space="preserve">Sinh viên bắt đầu:</w:t>
+      </w:r>
+      <w:r>
+        <w:rPr>
+          <w:rtl w:val="0"/>
+        </w:rPr>
+        <w:t xml:space="preserve"> Backend kiểm tra kỳ thi OPEN và trong khung giờ (nếu không thì báo EXAM_NOT_STARTED), khoá dòng exam_session để chọn câu chính cân bằng, ghi assigned_question vào Postgres, tạo ngữ cảnh phiên trong </w:t>
+      </w:r>
+      <w:r>
+        <w:rPr>
+          <w:b/>
+          <w:bCs/>
+          <w:rtl w:val="0"/>
+        </w:rPr>
+        <w:t xml:space="preserve">Amazon DynamoDB</w:t>
+      </w:r>
+      <w:r>
+        <w:rPr>
+          <w:rtl w:val="0"/>
+        </w:rPr>
+        <w:t xml:space="preserve"> và làm nóng Lambda STT thêm một lần.</w:t>
       </w:r>
     </w:p>
     <w:sectPr>
@@ -976,6 +1232,12 @@
   </w:num>
   <w:num w:numId="3">
     <w:abstractNumId w:val="3"/>
+  </w:num>
+  <w:num w:numId="4">
+    <w:abstractNumId w:val="2"/>
+    <w:lvlOverride w:ilvl="0">
+      <w:startOverride w:val="1"/>
+    </w:lvlOverride>
   </w:num>
 </w:numbering>
 </file>

</xml_diff>